<commit_message>
Add a section highlighting unique platform advantages
Update website copy and associated metadata to include a new section detailing the platform's key differentiators: interconnection depth, WhatsApp compliance, GST-native design, and zero reconciliation architecture.

Replit-Commit-Author: Agent
Replit-Commit-Session-Id: e70c97c4-e099-455a-b9ae-aa9a0dedb718
Replit-Commit-Checkpoint-Type: full_checkpoint
Replit-Commit-Event-Id: b1bdc827-6157-437a-af65-30900532e515
Replit-Commit-Screenshot-Url: https://storage.googleapis.com/screenshot-production-us-central1/713657ac-53c6-43a9-97a8-ef2697ef92d9/e70c97c4-e099-455a-b9ae-aa9a0dedb718/famN00F
Replit-Helium-Checkpoint-Created: true
</commit_message>
<xml_diff>
--- a/docs/website-module-copy.docx
+++ b/docs/website-module-copy.docx
@@ -2,7 +2,7 @@
 <file path=word/document.xml><?xml version="1.0" encoding="utf-8"?>
 <w:document xmlns:w="http://schemas.openxmlformats.org/wordprocessingml/2006/main" xmlns:m="http://schemas.openxmlformats.org/officeDocument/2006/math" xmlns:r="http://schemas.openxmlformats.org/officeDocument/2006/relationships" xmlns:o="urn:schemas-microsoft-com:office:office" xmlns:v="urn:schemas-microsoft-com:vml" xmlns:w10="urn:schemas-microsoft-com:office:word" xmlns:a="http://schemas.openxmlformats.org/drawingml/2006/main" xmlns:pic="http://schemas.openxmlformats.org/drawingml/2006/picture" xmlns:wp="http://schemas.openxmlformats.org/drawingml/2006/wordprocessingDrawing">
   <w:body>
-    <w:bookmarkStart w:id="35" w:name="X8892b700a7f45dbf230f85ee5c21e3b7b7a9ab4"/>
+    <w:bookmarkStart w:id="40" w:name="X8892b700a7f45dbf230f85ee5c21e3b7b7a9ab4"/>
     <w:p>
       <w:pPr>
         <w:pStyle w:val="Heading1"/>
@@ -67,13 +67,22 @@
       </w:r>
     </w:p>
     <w:bookmarkEnd w:id="20"/>
-    <w:bookmarkStart w:id="21" w:name="production-inventory"/>
+    <w:bookmarkStart w:id="25" w:name="X283f2201abda308f8b8901adbe25dc3423f5206"/>
     <w:p>
       <w:pPr>
         <w:pStyle w:val="Heading2"/>
       </w:pPr>
       <w:r>
-        <w:t xml:space="preserve">Production &amp; Inventory</w:t>
+        <w:t xml:space="preserve">What Makes It Genuinely Hard to Replicate</w:t>
+      </w:r>
+    </w:p>
+    <w:bookmarkStart w:id="21" w:name="X31a217027d05c4d2b5020ff00357fa72eaaba73"/>
+    <w:p>
+      <w:pPr>
+        <w:pStyle w:val="Heading3"/>
+      </w:pPr>
+      <w:r>
+        <w:t xml:space="preserve">1. Interconnection Depth — One System, Not Bolted Modules</w:t>
       </w:r>
     </w:p>
     <w:p>
@@ -81,247 +90,61 @@
         <w:pStyle w:val="FirstParagraph"/>
       </w:pPr>
       <w:r>
-        <w:rPr>
-          <w:b/>
-          <w:bCs/>
-        </w:rPr>
-        <w:t xml:space="preserve">Headline:</w:t>
-      </w:r>
-      <w:r>
-        <w:t xml:space="preserve"> </w:t>
-      </w:r>
-      <w:r>
-        <w:t xml:space="preserve">One entry. Five things happen automatically.</w:t>
-      </w:r>
-    </w:p>
-    <w:p>
-      <w:pPr>
-        <w:pStyle w:val="BodyText"/>
-      </w:pPr>
-      <w:r>
-        <w:rPr>
-          <w:b/>
-          <w:bCs/>
-        </w:rPr>
-        <w:t xml:space="preserve">Sub-headline:</w:t>
-      </w:r>
-      <w:r>
-        <w:t xml:space="preserve"> </w:t>
-      </w:r>
-      <w:r>
-        <w:t xml:space="preserve">Record a production batch and watch your raw material stock fall, your finished goods stock rise, your scrap register update, your yield variance calculate, and your accounting post — all without touching anything else.</w:t>
-      </w:r>
-    </w:p>
-    <w:p>
-      <w:pPr>
-        <w:pStyle w:val="BodyText"/>
-      </w:pPr>
-      <w:r>
-        <w:rPr>
-          <w:b/>
-          <w:bCs/>
-        </w:rPr>
-        <w:t xml:space="preserve">How the automation works:</w:t>
-      </w:r>
-      <w:r>
-        <w:t xml:space="preserve"> </w:t>
-      </w:r>
-      <w:r>
-        <w:t xml:space="preserve">When a production entry is saved, the system automatically:</w:t>
-      </w:r>
-      <w:r>
-        <w:t xml:space="preserve"> </w:t>
-      </w:r>
-      <w:r>
-        <w:t xml:space="preserve">1. Deducts the issued raw materials from inventory (FIFO — oldest batch consumed first, no manual selection)</w:t>
-      </w:r>
-      <w:r>
-        <w:t xml:space="preserve"> </w:t>
-      </w:r>
-      <w:r>
-        <w:t xml:space="preserve">2. Adds the finished goods quantity to inventory</w:t>
-      </w:r>
-      <w:r>
-        <w:t xml:space="preserve"> </w:t>
-      </w:r>
-      <w:r>
-        <w:t xml:space="preserve">3. Records any scrap generated as a separate inventory entry</w:t>
-      </w:r>
-      <w:r>
-        <w:t xml:space="preserve"> </w:t>
-      </w:r>
-      <w:r>
-        <w:t xml:space="preserve">4. Posts the corresponding cost journal entries to your accounting ledger</w:t>
-      </w:r>
-      <w:r>
-        <w:t xml:space="preserve"> </w:t>
-      </w:r>
-      <w:r>
-        <w:t xml:space="preserve">5. Calculates the yield variance (expected output vs actual output) and flags it if outside tolerance</w:t>
-      </w:r>
-    </w:p>
-    <w:p>
-      <w:pPr>
-        <w:pStyle w:val="BodyText"/>
-      </w:pPr>
-      <w:r>
-        <w:rPr>
-          <w:b/>
-          <w:bCs/>
-        </w:rPr>
-        <w:t xml:space="preserve">How it connects to other modules:</w:t>
-      </w:r>
-      <w:r>
-        <w:t xml:space="preserve"> </w:t>
-      </w:r>
-      <w:r>
-        <w:t xml:space="preserve">- Raw material stock levels feed the</w:t>
-      </w:r>
-      <w:r>
-        <w:t xml:space="preserve"> </w:t>
-      </w:r>
-      <w:r>
-        <w:rPr>
-          <w:b/>
-          <w:bCs/>
-        </w:rPr>
-        <w:t xml:space="preserve">Purchase Orders</w:t>
-      </w:r>
-      <w:r>
-        <w:t xml:space="preserve"> </w:t>
-      </w:r>
-      <w:r>
-        <w:t xml:space="preserve">module — you can see what needs to be reordered before it runs out</w:t>
-      </w:r>
-      <w:r>
-        <w:t xml:space="preserve"> </w:t>
-      </w:r>
-      <w:r>
-        <w:t xml:space="preserve">- Finished goods stock feeds the</w:t>
-      </w:r>
-      <w:r>
-        <w:t xml:space="preserve"> </w:t>
-      </w:r>
-      <w:r>
-        <w:rPr>
-          <w:b/>
-          <w:bCs/>
-        </w:rPr>
-        <w:t xml:space="preserve">Dispatch &amp; Gatepass</w:t>
-      </w:r>
-      <w:r>
-        <w:t xml:space="preserve"> </w:t>
-      </w:r>
-      <w:r>
-        <w:t xml:space="preserve">module — you can only dispatch what is actually in stock</w:t>
-      </w:r>
-      <w:r>
-        <w:t xml:space="preserve"> </w:t>
-      </w:r>
-      <w:r>
-        <w:t xml:space="preserve">- Production cost journals flow directly into</w:t>
-      </w:r>
-      <w:r>
-        <w:t xml:space="preserve"> </w:t>
-      </w:r>
-      <w:r>
-        <w:rPr>
-          <w:b/>
-          <w:bCs/>
-        </w:rPr>
-        <w:t xml:space="preserve">Accounting &amp; Ledger</w:t>
-      </w:r>
-      <w:r>
-        <w:t xml:space="preserve"> </w:t>
-      </w:r>
-      <w:r>
-        <w:t xml:space="preserve">— your P&amp;L reflects production costs in real time</w:t>
-      </w:r>
-      <w:r>
-        <w:t xml:space="preserve"> </w:t>
-      </w:r>
-      <w:r>
-        <w:t xml:space="preserve">- Machine-wise production can be preceded by</w:t>
-      </w:r>
-      <w:r>
-        <w:t xml:space="preserve"> </w:t>
-      </w:r>
-      <w:r>
-        <w:rPr>
-          <w:b/>
-          <w:bCs/>
-        </w:rPr>
-        <w:t xml:space="preserve">WhatsApp Checklist</w:t>
-      </w:r>
-      <w:r>
-        <w:t xml:space="preserve"> </w:t>
-      </w:r>
-      <w:r>
-        <w:t xml:space="preserve">completion — operators confirm startup checks before a batch begins</w:t>
-      </w:r>
-      <w:r>
-        <w:t xml:space="preserve"> </w:t>
-      </w:r>
-      <w:r>
-        <w:t xml:space="preserve">- Yield variance data feeds the</w:t>
-      </w:r>
-      <w:r>
-        <w:t xml:space="preserve"> </w:t>
-      </w:r>
-      <w:r>
-        <w:rPr>
-          <w:b/>
-          <w:bCs/>
-        </w:rPr>
-        <w:t xml:space="preserve">MIS Analytics</w:t>
-      </w:r>
-      <w:r>
-        <w:t xml:space="preserve"> </w:t>
-      </w:r>
-      <w:r>
-        <w:t xml:space="preserve">module — management sees production efficiency on their dashboard</w:t>
-      </w:r>
-    </w:p>
-    <w:p>
-      <w:pPr>
-        <w:pStyle w:val="BodyText"/>
-      </w:pPr>
-      <w:r>
-        <w:rPr>
-          <w:b/>
-          <w:bCs/>
-        </w:rPr>
-        <w:t xml:space="preserve">What other apps make you do manually:</w:t>
-      </w:r>
-      <w:r>
-        <w:t xml:space="preserve"> </w:t>
-      </w:r>
-      <w:r>
-        <w:t xml:space="preserve">- Separate stock adjustment entries after production</w:t>
-      </w:r>
-      <w:r>
-        <w:t xml:space="preserve"> </w:t>
-      </w:r>
-      <w:r>
-        <w:t xml:space="preserve">- Manual journal entries for raw material cost</w:t>
-      </w:r>
-      <w:r>
-        <w:t xml:space="preserve"> </w:t>
-      </w:r>
-      <w:r>
-        <w:t xml:space="preserve">- End-of-month reconciliation between the production register and the inventory register</w:t>
-      </w:r>
-      <w:r>
-        <w:t xml:space="preserve"> </w:t>
-      </w:r>
-      <w:r>
-        <w:t xml:space="preserve">- Separate scrap write-off entries</w:t>
-      </w:r>
-      <w:r>
-        <w:t xml:space="preserve"> </w:t>
-      </w:r>
-      <w:r>
-        <w:t xml:space="preserve">- Export data to Excel to calculate yield variance</w:t>
+        <w:t xml:space="preserve">Most ERPs are built as separate products that share a login. Their inventory module talks to their accounting module through a sync job or an API call — which means delays, mismatches, and reconciliation work. Kinto Smart Ops is built on a single database, a single session, and a single accounting ledger. A production entry, a dispatch, and an invoice all write to the same database in the same transaction. There is no middleware, no nightly batch sync, no integration to maintain. When something happens in operations, accounting reflects it instantly — because they are the same system, not two systems talking to each other.</w:t>
+      </w:r>
+    </w:p>
+    <w:bookmarkEnd w:id="21"/>
+    <w:bookmarkStart w:id="22" w:name="X1215156321b165e955194ce58cc75672b14f2fc"/>
+    <w:p>
+      <w:pPr>
+        <w:pStyle w:val="Heading3"/>
+      </w:pPr>
+      <w:r>
+        <w:t xml:space="preserve">2. WhatsApp Compliance — An Advantage No Major ERP Has</w:t>
+      </w:r>
+    </w:p>
+    <w:p>
+      <w:pPr>
+        <w:pStyle w:val="FirstParagraph"/>
+      </w:pPr>
+      <w:r>
+        <w:t xml:space="preserve">Tally, Zoho, SAP, Odoo, and ERPNext do not offer this. Kinto Smart Ops is integrated with WhatsApp at the platform level. Operators receive automated startup messages at shift time. They complete machine checklists by replying on WhatsApp — their personal phone, no app to install, no training required. If an operator misses the checklist window, the supervisor gets an automatic WhatsApp alert. Every response is timestamped and stored as an audit record. This is not a third-party plugin. It is built into the system’s core — the same WhatsApp infrastructure also sends maintenance due alerts, document expiry alerts, and payment reminders. One connected notification system across the entire platform.</w:t>
+      </w:r>
+    </w:p>
+    <w:bookmarkEnd w:id="22"/>
+    <w:bookmarkStart w:id="23" w:name="X83481d7d46ac78cbb8d790b8ea3477e6b2daf36"/>
+    <w:p>
+      <w:pPr>
+        <w:pStyle w:val="Heading3"/>
+      </w:pPr>
+      <w:r>
+        <w:t xml:space="preserve">3. GST-Native from the Ground Up — Not Retrofitted</w:t>
+      </w:r>
+    </w:p>
+    <w:p>
+      <w:pPr>
+        <w:pStyle w:val="FirstParagraph"/>
+      </w:pPr>
+      <w:r>
+        <w:t xml:space="preserve">Most international ERPs (SAP, Odoo, ERPNext) were built for global markets and had GST added later — as a configuration layer on top of a generic tax engine. Kinto Smart Ops was designed from day one for Indian tax compliance. CGST/SGST vs IGST is determined automatically based on buyer state — no manual selection. HSN codes are embedded in the product master. The gatepass workflow exists because Indian dispatch compliance requires a physical delivery challan before goods move. The Chart of Accounts is seeded with Indian-standard account groups. GST is not a feature added to the system — it is the system.</w:t>
+      </w:r>
+    </w:p>
+    <w:bookmarkEnd w:id="23"/>
+    <w:bookmarkStart w:id="24" w:name="Xd46ecb81d5cc7c1fb7745b1c962d6735f326896"/>
+    <w:p>
+      <w:pPr>
+        <w:pStyle w:val="Heading3"/>
+      </w:pPr>
+      <w:r>
+        <w:t xml:space="preserve">4. Zero Reconciliation Architecture — Books Are Always Current</w:t>
+      </w:r>
+    </w:p>
+    <w:p>
+      <w:pPr>
+        <w:pStyle w:val="FirstParagraph"/>
+      </w:pPr>
+      <w:r>
+        <w:t xml:space="preserve">In most businesses using disconnected tools, the accounts team spends 2–3 days every month reconciling the operations data with the books. Invoices raised in one system have to be entered again in Tally. Purchases received in the inventory tool need a voucher in the accounting software. Payroll processed in an HRMS needs to be journalised manually. In Kinto Smart Ops, every transaction — invoice, purchase receipt, expense voucher, payroll run, payment collected, production batch — posts its accounting journal entries automatically in the same moment it is created. There is no month-end catch-up. The Trial Balance, P&amp;L, and Balance Sheet are accurate at any point during the month, not just after the accounts team has finished their work.</w:t>
       </w:r>
     </w:p>
     <w:p>
@@ -331,32 +154,221 @@
         </w:pict>
       </w:r>
     </w:p>
-    <w:bookmarkEnd w:id="21"/>
-    <w:bookmarkStart w:id="22" w:name="purchase-orders"/>
+    <w:bookmarkEnd w:id="24"/>
+    <w:bookmarkEnd w:id="25"/>
+    <w:bookmarkStart w:id="26" w:name="production-inventory"/>
     <w:p>
       <w:pPr>
         <w:pStyle w:val="Heading2"/>
       </w:pPr>
       <w:r>
+        <w:t xml:space="preserve">Production &amp; Inventory</w:t>
+      </w:r>
+    </w:p>
+    <w:p>
+      <w:pPr>
+        <w:pStyle w:val="FirstParagraph"/>
+      </w:pPr>
+      <w:r>
+        <w:rPr>
+          <w:b/>
+          <w:bCs/>
+        </w:rPr>
+        <w:t xml:space="preserve">Headline:</w:t>
+      </w:r>
+      <w:r>
+        <w:t xml:space="preserve"> </w:t>
+      </w:r>
+      <w:r>
+        <w:t xml:space="preserve">One entry. Five things happen automatically.</w:t>
+      </w:r>
+    </w:p>
+    <w:p>
+      <w:pPr>
+        <w:pStyle w:val="BodyText"/>
+      </w:pPr>
+      <w:r>
+        <w:rPr>
+          <w:b/>
+          <w:bCs/>
+        </w:rPr>
+        <w:t xml:space="preserve">Sub-headline:</w:t>
+      </w:r>
+      <w:r>
+        <w:t xml:space="preserve"> </w:t>
+      </w:r>
+      <w:r>
+        <w:t xml:space="preserve">Record a production batch and watch your raw material stock fall, your finished goods stock rise, your scrap register update, your yield variance calculate, and your accounting post — all without touching anything else.</w:t>
+      </w:r>
+    </w:p>
+    <w:p>
+      <w:pPr>
+        <w:pStyle w:val="BodyText"/>
+      </w:pPr>
+      <w:r>
+        <w:rPr>
+          <w:b/>
+          <w:bCs/>
+        </w:rPr>
+        <w:t xml:space="preserve">How the automation works:</w:t>
+      </w:r>
+      <w:r>
+        <w:t xml:space="preserve"> </w:t>
+      </w:r>
+      <w:r>
+        <w:t xml:space="preserve">When a production entry is saved, the system automatically:</w:t>
+      </w:r>
+      <w:r>
+        <w:t xml:space="preserve"> </w:t>
+      </w:r>
+      <w:r>
+        <w:t xml:space="preserve">1. Deducts the issued raw materials from inventory (FIFO — oldest batch consumed first, no manual selection)</w:t>
+      </w:r>
+      <w:r>
+        <w:t xml:space="preserve"> </w:t>
+      </w:r>
+      <w:r>
+        <w:t xml:space="preserve">2. Adds the finished goods quantity to inventory</w:t>
+      </w:r>
+      <w:r>
+        <w:t xml:space="preserve"> </w:t>
+      </w:r>
+      <w:r>
+        <w:t xml:space="preserve">3. Records any scrap generated as a separate inventory entry</w:t>
+      </w:r>
+      <w:r>
+        <w:t xml:space="preserve"> </w:t>
+      </w:r>
+      <w:r>
+        <w:t xml:space="preserve">4. Posts the corresponding cost journal entries to your accounting ledger</w:t>
+      </w:r>
+      <w:r>
+        <w:t xml:space="preserve"> </w:t>
+      </w:r>
+      <w:r>
+        <w:t xml:space="preserve">5. Calculates the yield variance (expected output vs actual output) and flags it if outside tolerance</w:t>
+      </w:r>
+    </w:p>
+    <w:p>
+      <w:pPr>
+        <w:pStyle w:val="BodyText"/>
+      </w:pPr>
+      <w:r>
+        <w:rPr>
+          <w:b/>
+          <w:bCs/>
+        </w:rPr>
+        <w:t xml:space="preserve">How it connects to other modules:</w:t>
+      </w:r>
+      <w:r>
+        <w:t xml:space="preserve"> </w:t>
+      </w:r>
+      <w:r>
+        <w:t xml:space="preserve">- Raw material stock levels feed the</w:t>
+      </w:r>
+      <w:r>
+        <w:t xml:space="preserve"> </w:t>
+      </w:r>
+      <w:r>
+        <w:rPr>
+          <w:b/>
+          <w:bCs/>
+        </w:rPr>
         <w:t xml:space="preserve">Purchase Orders</w:t>
       </w:r>
-    </w:p>
-    <w:p>
-      <w:pPr>
-        <w:pStyle w:val="FirstParagraph"/>
-      </w:pPr>
-      <w:r>
-        <w:rPr>
-          <w:b/>
-          <w:bCs/>
-        </w:rPr>
-        <w:t xml:space="preserve">Headline:</w:t>
-      </w:r>
-      <w:r>
-        <w:t xml:space="preserve"> </w:t>
-      </w:r>
-      <w:r>
-        <w:t xml:space="preserve">Raise a PO. Everything else follows automatically.</w:t>
+      <w:r>
+        <w:t xml:space="preserve"> </w:t>
+      </w:r>
+      <w:r>
+        <w:t xml:space="preserve">module — you can see what needs to be reordered before it runs out</w:t>
+      </w:r>
+      <w:r>
+        <w:t xml:space="preserve"> </w:t>
+      </w:r>
+      <w:r>
+        <w:t xml:space="preserve">- Finished goods stock feeds the</w:t>
+      </w:r>
+      <w:r>
+        <w:t xml:space="preserve"> </w:t>
+      </w:r>
+      <w:r>
+        <w:rPr>
+          <w:b/>
+          <w:bCs/>
+        </w:rPr>
+        <w:t xml:space="preserve">Dispatch &amp; Gatepass</w:t>
+      </w:r>
+      <w:r>
+        <w:t xml:space="preserve"> </w:t>
+      </w:r>
+      <w:r>
+        <w:t xml:space="preserve">module — you can only dispatch what is actually in stock</w:t>
+      </w:r>
+      <w:r>
+        <w:t xml:space="preserve"> </w:t>
+      </w:r>
+      <w:r>
+        <w:t xml:space="preserve">- Production cost journals flow directly into</w:t>
+      </w:r>
+      <w:r>
+        <w:t xml:space="preserve"> </w:t>
+      </w:r>
+      <w:r>
+        <w:rPr>
+          <w:b/>
+          <w:bCs/>
+        </w:rPr>
+        <w:t xml:space="preserve">Accounting &amp; Ledger</w:t>
+      </w:r>
+      <w:r>
+        <w:t xml:space="preserve"> </w:t>
+      </w:r>
+      <w:r>
+        <w:t xml:space="preserve">— your P&amp;L reflects production costs in real time</w:t>
+      </w:r>
+      <w:r>
+        <w:t xml:space="preserve"> </w:t>
+      </w:r>
+      <w:r>
+        <w:t xml:space="preserve">- Machine-wise production can be preceded by</w:t>
+      </w:r>
+      <w:r>
+        <w:t xml:space="preserve"> </w:t>
+      </w:r>
+      <w:r>
+        <w:rPr>
+          <w:b/>
+          <w:bCs/>
+        </w:rPr>
+        <w:t xml:space="preserve">WhatsApp Checklist</w:t>
+      </w:r>
+      <w:r>
+        <w:t xml:space="preserve"> </w:t>
+      </w:r>
+      <w:r>
+        <w:t xml:space="preserve">completion — operators confirm startup checks before a batch begins</w:t>
+      </w:r>
+      <w:r>
+        <w:t xml:space="preserve"> </w:t>
+      </w:r>
+      <w:r>
+        <w:t xml:space="preserve">- Yield variance data feeds the</w:t>
+      </w:r>
+      <w:r>
+        <w:t xml:space="preserve"> </w:t>
+      </w:r>
+      <w:r>
+        <w:rPr>
+          <w:b/>
+          <w:bCs/>
+        </w:rPr>
+        <w:t xml:space="preserve">MIS Analytics</w:t>
+      </w:r>
+      <w:r>
+        <w:t xml:space="preserve"> </w:t>
+      </w:r>
+      <w:r>
+        <w:t xml:space="preserve">module — management sees production efficiency on their dashboard</w:t>
       </w:r>
     </w:p>
     <w:p>
@@ -368,239 +380,37 @@
           <w:b/>
           <w:bCs/>
         </w:rPr>
-        <w:t xml:space="preserve">Sub-headline:</w:t>
-      </w:r>
-      <w:r>
-        <w:t xml:space="preserve"> </w:t>
-      </w:r>
-      <w:r>
-        <w:t xml:space="preserve">From the moment you create a purchase order to the moment goods arrive and stock is updated, the system handles every step. No separate GRN entry. No separate inventory update. No manual accounting.</w:t>
-      </w:r>
-    </w:p>
-    <w:p>
-      <w:pPr>
-        <w:pStyle w:val="BodyText"/>
-      </w:pPr>
-      <w:r>
-        <w:rPr>
-          <w:b/>
-          <w:bCs/>
-        </w:rPr>
-        <w:t xml:space="preserve">How the automation works:</w:t>
-      </w:r>
-      <w:r>
-        <w:t xml:space="preserve"> </w:t>
-      </w:r>
-      <w:r>
-        <w:t xml:space="preserve">When a Goods Receipt Note (GRN) is confirmed against a PO:</w:t>
-      </w:r>
-      <w:r>
-        <w:t xml:space="preserve"> </w:t>
-      </w:r>
-      <w:r>
-        <w:t xml:space="preserve">1. Inventory is updated immediately — the received quantity is added to stock under the correct batch</w:t>
-      </w:r>
-      <w:r>
-        <w:t xml:space="preserve"> </w:t>
-      </w:r>
-      <w:r>
-        <w:t xml:space="preserve">2. The PO status updates automatically (partial or fully received)</w:t>
-      </w:r>
-      <w:r>
-        <w:t xml:space="preserve"> </w:t>
-      </w:r>
-      <w:r>
-        <w:t xml:space="preserve">3. A purchase liability is posted to the accounting ledger</w:t>
-      </w:r>
-      <w:r>
-        <w:t xml:space="preserve"> </w:t>
-      </w:r>
-      <w:r>
-        <w:t xml:space="preserve">4. Vendor outstanding balance increases automatically</w:t>
-      </w:r>
-    </w:p>
-    <w:p>
-      <w:pPr>
-        <w:pStyle w:val="BodyText"/>
-      </w:pPr>
-      <w:r>
-        <w:t xml:space="preserve">When a purchase return is raised:</w:t>
-      </w:r>
-      <w:r>
-        <w:t xml:space="preserve"> </w:t>
-      </w:r>
-      <w:r>
-        <w:t xml:space="preserve">1. Stock reduces immediately</w:t>
-      </w:r>
-      <w:r>
-        <w:t xml:space="preserve"> </w:t>
-      </w:r>
-      <w:r>
-        <w:t xml:space="preserve">2. A vendor debit note is created</w:t>
-      </w:r>
-      <w:r>
-        <w:t xml:space="preserve"> </w:t>
-      </w:r>
-      <w:r>
-        <w:t xml:space="preserve">3. The accounting reversal posts automatically</w:t>
-      </w:r>
-    </w:p>
-    <w:p>
-      <w:pPr>
-        <w:pStyle w:val="BodyText"/>
-      </w:pPr>
-      <w:r>
-        <w:rPr>
-          <w:b/>
-          <w:bCs/>
-        </w:rPr>
-        <w:t xml:space="preserve">How it connects to other modules:</w:t>
-      </w:r>
-      <w:r>
-        <w:t xml:space="preserve"> </w:t>
-      </w:r>
-      <w:r>
-        <w:t xml:space="preserve">- Received raw materials go directly into</w:t>
-      </w:r>
-      <w:r>
-        <w:t xml:space="preserve"> </w:t>
-      </w:r>
-      <w:r>
-        <w:rPr>
-          <w:b/>
-          <w:bCs/>
-        </w:rPr>
-        <w:t xml:space="preserve">Production &amp; Inventory</w:t>
-      </w:r>
-      <w:r>
-        <w:t xml:space="preserve"> </w:t>
-      </w:r>
-      <w:r>
-        <w:t xml:space="preserve">— they’re available for issuance the moment they’re received</w:t>
-      </w:r>
-      <w:r>
-        <w:t xml:space="preserve"> </w:t>
-      </w:r>
-      <w:r>
-        <w:t xml:space="preserve">- Purchase liabilities post automatically to</w:t>
-      </w:r>
-      <w:r>
-        <w:t xml:space="preserve"> </w:t>
-      </w:r>
-      <w:r>
-        <w:rPr>
-          <w:b/>
-          <w:bCs/>
-        </w:rPr>
-        <w:t xml:space="preserve">Accounting &amp; Ledger</w:t>
-      </w:r>
-      <w:r>
-        <w:t xml:space="preserve"> </w:t>
-      </w:r>
-      <w:r>
-        <w:t xml:space="preserve">— your creditor balances are always live</w:t>
-      </w:r>
-      <w:r>
-        <w:t xml:space="preserve"> </w:t>
-      </w:r>
-      <w:r>
-        <w:t xml:space="preserve">- Vendor payment records in</w:t>
-      </w:r>
-      <w:r>
-        <w:t xml:space="preserve"> </w:t>
-      </w:r>
-      <w:r>
-        <w:rPr>
-          <w:b/>
-          <w:bCs/>
-        </w:rPr>
-        <w:t xml:space="preserve">Accounting</w:t>
-      </w:r>
-      <w:r>
-        <w:t xml:space="preserve"> </w:t>
-      </w:r>
-      <w:r>
-        <w:t xml:space="preserve">reduce the purchase outstanding automatically</w:t>
-      </w:r>
-      <w:r>
-        <w:t xml:space="preserve"> </w:t>
-      </w:r>
-      <w:r>
-        <w:t xml:space="preserve">- Purchase spend data feeds</w:t>
-      </w:r>
-      <w:r>
-        <w:t xml:space="preserve"> </w:t>
-      </w:r>
-      <w:r>
-        <w:rPr>
-          <w:b/>
-          <w:bCs/>
-        </w:rPr>
-        <w:t xml:space="preserve">MIS Analytics</w:t>
-      </w:r>
-      <w:r>
-        <w:t xml:space="preserve"> </w:t>
-      </w:r>
-      <w:r>
-        <w:t xml:space="preserve">— management sees vendor-wise spend and purchase trends</w:t>
-      </w:r>
-      <w:r>
-        <w:t xml:space="preserve"> </w:t>
-      </w:r>
-      <w:r>
-        <w:t xml:space="preserve">- Vendor documents (quality certificates, agreements) are stored in the</w:t>
-      </w:r>
-      <w:r>
-        <w:t xml:space="preserve"> </w:t>
-      </w:r>
-      <w:r>
-        <w:rPr>
-          <w:b/>
-          <w:bCs/>
-        </w:rPr>
-        <w:t xml:space="preserve">Documents</w:t>
-      </w:r>
-      <w:r>
-        <w:t xml:space="preserve"> </w:t>
-      </w:r>
-      <w:r>
-        <w:t xml:space="preserve">module and linked to the vendor</w:t>
-      </w:r>
-    </w:p>
-    <w:p>
-      <w:pPr>
-        <w:pStyle w:val="BodyText"/>
-      </w:pPr>
-      <w:r>
-        <w:rPr>
-          <w:b/>
-          <w:bCs/>
-        </w:rPr>
         <w:t xml:space="preserve">What other apps make you do manually:</w:t>
       </w:r>
       <w:r>
         <w:t xml:space="preserve"> </w:t>
       </w:r>
       <w:r>
-        <w:t xml:space="preserve">- Separate inventory receipt entry after raising a GRN</w:t>
-      </w:r>
-      <w:r>
-        <w:t xml:space="preserve"> </w:t>
-      </w:r>
-      <w:r>
-        <w:t xml:space="preserve">- Manual accounting entries for purchase and liability</w:t>
-      </w:r>
-      <w:r>
-        <w:t xml:space="preserve"> </w:t>
-      </w:r>
-      <w:r>
-        <w:t xml:space="preserve">- Separate credit note or debit note creation after a return</w:t>
-      </w:r>
-      <w:r>
-        <w:t xml:space="preserve"> </w:t>
-      </w:r>
-      <w:r>
-        <w:t xml:space="preserve">- Reconciling purchase register with inventory register at month end</w:t>
+        <w:t xml:space="preserve">- Separate stock adjustment entries after production</w:t>
+      </w:r>
+      <w:r>
+        <w:t xml:space="preserve"> </w:t>
+      </w:r>
+      <w:r>
+        <w:t xml:space="preserve">- Manual journal entries for raw material cost</w:t>
+      </w:r>
+      <w:r>
+        <w:t xml:space="preserve"> </w:t>
+      </w:r>
+      <w:r>
+        <w:t xml:space="preserve">- End-of-month reconciliation between the production register and the inventory register</w:t>
+      </w:r>
+      <w:r>
+        <w:t xml:space="preserve"> </w:t>
+      </w:r>
+      <w:r>
+        <w:t xml:space="preserve">- Separate scrap write-off entries</w:t>
+      </w:r>
+      <w:r>
+        <w:t xml:space="preserve"> </w:t>
+      </w:r>
+      <w:r>
+        <w:t xml:space="preserve">- Export data to Excel to calculate yield variance</w:t>
       </w:r>
     </w:p>
     <w:p>
@@ -610,14 +420,14 @@
         </w:pict>
       </w:r>
     </w:p>
-    <w:bookmarkEnd w:id="22"/>
-    <w:bookmarkStart w:id="23" w:name="gatepasses-dispatch"/>
+    <w:bookmarkEnd w:id="26"/>
+    <w:bookmarkStart w:id="27" w:name="purchase-orders"/>
     <w:p>
       <w:pPr>
         <w:pStyle w:val="Heading2"/>
       </w:pPr>
       <w:r>
-        <w:t xml:space="preserve">Gatepasses &amp; Dispatch</w:t>
+        <w:t xml:space="preserve">Purchase Orders</w:t>
       </w:r>
     </w:p>
     <w:p>
@@ -635,7 +445,7 @@
         <w:t xml:space="preserve"> </w:t>
       </w:r>
       <w:r>
-        <w:t xml:space="preserve">The system ensures no goods leave without a paper trail — and it’s not a setting you can turn off.</w:t>
+        <w:t xml:space="preserve">Raise a PO. Everything else follows automatically.</w:t>
       </w:r>
     </w:p>
     <w:p>
@@ -653,7 +463,7 @@
         <w:t xml:space="preserve"> </w:t>
       </w:r>
       <w:r>
-        <w:t xml:space="preserve">Dispatch is enforced, not optional. A gatepass cannot exist without an invoice. An invoice cannot exist without a gatepass. Every truck that leaves is accounted for — automatically and permanently.</w:t>
+        <w:t xml:space="preserve">From the moment you create a purchase order to the moment goods arrive and stock is updated, the system handles every step. No separate GRN entry. No separate inventory update. No manual accounting.</w:t>
       </w:r>
     </w:p>
     <w:p>
@@ -671,31 +481,31 @@
         <w:t xml:space="preserve"> </w:t>
       </w:r>
       <w:r>
-        <w:t xml:space="preserve">When a gatepass is created and confirmed:</w:t>
-      </w:r>
-      <w:r>
-        <w:t xml:space="preserve"> </w:t>
-      </w:r>
-      <w:r>
-        <w:t xml:space="preserve">1. The linked invoice is marked as dispatched automatically</w:t>
-      </w:r>
-      <w:r>
-        <w:t xml:space="preserve"> </w:t>
-      </w:r>
-      <w:r>
-        <w:t xml:space="preserve">2. Finished goods stock is deducted from inventory immediately</w:t>
-      </w:r>
-      <w:r>
-        <w:t xml:space="preserve"> </w:t>
-      </w:r>
-      <w:r>
-        <w:t xml:space="preserve">3. A delivery challan is generated for printing — no separate document to prepare</w:t>
-      </w:r>
-      <w:r>
-        <w:t xml:space="preserve"> </w:t>
-      </w:r>
-      <w:r>
-        <w:t xml:space="preserve">4. Dispatch tracking record is created (vehicle, driver, transporter, time)</w:t>
+        <w:t xml:space="preserve">When a Goods Receipt Note (GRN) is confirmed against a PO:</w:t>
+      </w:r>
+      <w:r>
+        <w:t xml:space="preserve"> </w:t>
+      </w:r>
+      <w:r>
+        <w:t xml:space="preserve">1. Inventory is updated immediately — the received quantity is added to stock under the correct batch</w:t>
+      </w:r>
+      <w:r>
+        <w:t xml:space="preserve"> </w:t>
+      </w:r>
+      <w:r>
+        <w:t xml:space="preserve">2. The PO status updates automatically (partial or fully received)</w:t>
+      </w:r>
+      <w:r>
+        <w:t xml:space="preserve"> </w:t>
+      </w:r>
+      <w:r>
+        <w:t xml:space="preserve">3. A purchase liability is posted to the accounting ledger</w:t>
+      </w:r>
+      <w:r>
+        <w:t xml:space="preserve"> </w:t>
+      </w:r>
+      <w:r>
+        <w:t xml:space="preserve">4. Vendor outstanding balance increases automatically</w:t>
       </w:r>
     </w:p>
     <w:p>
@@ -703,35 +513,19 @@
         <w:pStyle w:val="BodyText"/>
       </w:pPr>
       <w:r>
-        <w:t xml:space="preserve">When a sales return is received:</w:t>
-      </w:r>
-      <w:r>
-        <w:t xml:space="preserve"> </w:t>
-      </w:r>
-      <w:r>
-        <w:t xml:space="preserve">1. Goods are re-added to finished goods inventory automatically</w:t>
-      </w:r>
-      <w:r>
-        <w:t xml:space="preserve"> </w:t>
-      </w:r>
-      <w:r>
-        <w:t xml:space="preserve">2. A credit note is triggered in the</w:t>
-      </w:r>
-      <w:r>
-        <w:t xml:space="preserve"> </w:t>
-      </w:r>
-      <w:r>
-        <w:rPr>
-          <w:b/>
-          <w:bCs/>
-        </w:rPr>
-        <w:t xml:space="preserve">Invoicing</w:t>
-      </w:r>
-      <w:r>
-        <w:t xml:space="preserve"> </w:t>
-      </w:r>
-      <w:r>
-        <w:t xml:space="preserve">module</w:t>
+        <w:t xml:space="preserve">When a purchase return is raised:</w:t>
+      </w:r>
+      <w:r>
+        <w:t xml:space="preserve"> </w:t>
+      </w:r>
+      <w:r>
+        <w:t xml:space="preserve">1. Stock reduces immediately</w:t>
+      </w:r>
+      <w:r>
+        <w:t xml:space="preserve"> </w:t>
+      </w:r>
+      <w:r>
+        <w:t xml:space="preserve">2. A vendor debit note is created</w:t>
       </w:r>
       <w:r>
         <w:t xml:space="preserve"> </w:t>
@@ -755,7 +549,7 @@
         <w:t xml:space="preserve"> </w:t>
       </w:r>
       <w:r>
-        <w:t xml:space="preserve">- Gatepass pulls stock from</w:t>
+        <w:t xml:space="preserve">- Received raw materials go directly into</w:t>
       </w:r>
       <w:r>
         <w:t xml:space="preserve"> </w:t>
@@ -771,35 +565,57 @@
         <w:t xml:space="preserve"> </w:t>
       </w:r>
       <w:r>
-        <w:t xml:space="preserve">— you can only dispatch goods that physically exist in stock</w:t>
-      </w:r>
-      <w:r>
-        <w:t xml:space="preserve"> </w:t>
-      </w:r>
-      <w:r>
-        <w:t xml:space="preserve">- Gatepass is mandatory before an</w:t>
-      </w:r>
-      <w:r>
-        <w:t xml:space="preserve"> </w:t>
-      </w:r>
-      <w:r>
-        <w:rPr>
-          <w:b/>
-          <w:bCs/>
-        </w:rPr>
-        <w:t xml:space="preserve">Invoice</w:t>
-      </w:r>
-      <w:r>
-        <w:t xml:space="preserve"> </w:t>
-      </w:r>
-      <w:r>
-        <w:t xml:space="preserve">is raised — the workflow enforces this, no workaround exists</w:t>
-      </w:r>
-      <w:r>
-        <w:t xml:space="preserve"> </w:t>
-      </w:r>
-      <w:r>
-        <w:t xml:space="preserve">- Dispatch tracking data feeds</w:t>
+        <w:t xml:space="preserve">— they’re available for issuance the moment they’re received</w:t>
+      </w:r>
+      <w:r>
+        <w:t xml:space="preserve"> </w:t>
+      </w:r>
+      <w:r>
+        <w:t xml:space="preserve">- Purchase liabilities post automatically to</w:t>
+      </w:r>
+      <w:r>
+        <w:t xml:space="preserve"> </w:t>
+      </w:r>
+      <w:r>
+        <w:rPr>
+          <w:b/>
+          <w:bCs/>
+        </w:rPr>
+        <w:t xml:space="preserve">Accounting &amp; Ledger</w:t>
+      </w:r>
+      <w:r>
+        <w:t xml:space="preserve"> </w:t>
+      </w:r>
+      <w:r>
+        <w:t xml:space="preserve">— your creditor balances are always live</w:t>
+      </w:r>
+      <w:r>
+        <w:t xml:space="preserve"> </w:t>
+      </w:r>
+      <w:r>
+        <w:t xml:space="preserve">- Vendor payment records in</w:t>
+      </w:r>
+      <w:r>
+        <w:t xml:space="preserve"> </w:t>
+      </w:r>
+      <w:r>
+        <w:rPr>
+          <w:b/>
+          <w:bCs/>
+        </w:rPr>
+        <w:t xml:space="preserve">Accounting</w:t>
+      </w:r>
+      <w:r>
+        <w:t xml:space="preserve"> </w:t>
+      </w:r>
+      <w:r>
+        <w:t xml:space="preserve">reduce the purchase outstanding automatically</w:t>
+      </w:r>
+      <w:r>
+        <w:t xml:space="preserve"> </w:t>
+      </w:r>
+      <w:r>
+        <w:t xml:space="preserve">- Purchase spend data feeds</w:t>
       </w:r>
       <w:r>
         <w:t xml:space="preserve"> </w:t>
@@ -815,29 +631,29 @@
         <w:t xml:space="preserve"> </w:t>
       </w:r>
       <w:r>
-        <w:t xml:space="preserve">— delivery performance metrics are always live</w:t>
-      </w:r>
-      <w:r>
-        <w:t xml:space="preserve"> </w:t>
-      </w:r>
-      <w:r>
-        <w:t xml:space="preserve">- Sales returns link back to the original</w:t>
-      </w:r>
-      <w:r>
-        <w:t xml:space="preserve"> </w:t>
-      </w:r>
-      <w:r>
-        <w:rPr>
-          <w:b/>
-          <w:bCs/>
-        </w:rPr>
-        <w:t xml:space="preserve">Invoice</w:t>
-      </w:r>
-      <w:r>
-        <w:t xml:space="preserve"> </w:t>
-      </w:r>
-      <w:r>
-        <w:t xml:space="preserve">and reverse both stock and accounting automatically</w:t>
+        <w:t xml:space="preserve">— management sees vendor-wise spend and purchase trends</w:t>
+      </w:r>
+      <w:r>
+        <w:t xml:space="preserve"> </w:t>
+      </w:r>
+      <w:r>
+        <w:t xml:space="preserve">- Vendor documents (quality certificates, agreements) are stored in the</w:t>
+      </w:r>
+      <w:r>
+        <w:t xml:space="preserve"> </w:t>
+      </w:r>
+      <w:r>
+        <w:rPr>
+          <w:b/>
+          <w:bCs/>
+        </w:rPr>
+        <w:t xml:space="preserve">Documents</w:t>
+      </w:r>
+      <w:r>
+        <w:t xml:space="preserve"> </w:t>
+      </w:r>
+      <w:r>
+        <w:t xml:space="preserve">module and linked to the vendor</w:t>
       </w:r>
     </w:p>
     <w:p>
@@ -855,25 +671,25 @@
         <w:t xml:space="preserve"> </w:t>
       </w:r>
       <w:r>
-        <w:t xml:space="preserve">- No other mainstream ERP enforces gatepass before invoice as a system-level constraint — it’s always a configurable workflow, meaning it can be bypassed</w:t>
-      </w:r>
-      <w:r>
-        <w:t xml:space="preserve"> </w:t>
-      </w:r>
-      <w:r>
-        <w:t xml:space="preserve">- Separate stock deduction after dispatch</w:t>
-      </w:r>
-      <w:r>
-        <w:t xml:space="preserve"> </w:t>
-      </w:r>
-      <w:r>
-        <w:t xml:space="preserve">- Separate accounting entry for cost of goods dispatched</w:t>
-      </w:r>
-      <w:r>
-        <w:t xml:space="preserve"> </w:t>
-      </w:r>
-      <w:r>
-        <w:t xml:space="preserve">- Manual delivery challan preparation</w:t>
+        <w:t xml:space="preserve">- Separate inventory receipt entry after raising a GRN</w:t>
+      </w:r>
+      <w:r>
+        <w:t xml:space="preserve"> </w:t>
+      </w:r>
+      <w:r>
+        <w:t xml:space="preserve">- Manual accounting entries for purchase and liability</w:t>
+      </w:r>
+      <w:r>
+        <w:t xml:space="preserve"> </w:t>
+      </w:r>
+      <w:r>
+        <w:t xml:space="preserve">- Separate credit note or debit note creation after a return</w:t>
+      </w:r>
+      <w:r>
+        <w:t xml:space="preserve"> </w:t>
+      </w:r>
+      <w:r>
+        <w:t xml:space="preserve">- Reconciling purchase register with inventory register at month end</w:t>
       </w:r>
     </w:p>
     <w:p>
@@ -883,14 +699,14 @@
         </w:pict>
       </w:r>
     </w:p>
-    <w:bookmarkEnd w:id="23"/>
-    <w:bookmarkStart w:id="24" w:name="sales-invoicing-gst"/>
+    <w:bookmarkEnd w:id="27"/>
+    <w:bookmarkStart w:id="28" w:name="gatepasses-dispatch"/>
     <w:p>
       <w:pPr>
         <w:pStyle w:val="Heading2"/>
       </w:pPr>
       <w:r>
-        <w:t xml:space="preserve">Sales Invoicing &amp; GST</w:t>
+        <w:t xml:space="preserve">Gatepasses &amp; Dispatch</w:t>
       </w:r>
     </w:p>
     <w:p>
@@ -908,7 +724,7 @@
         <w:t xml:space="preserve"> </w:t>
       </w:r>
       <w:r>
-        <w:t xml:space="preserve">Raise an invoice. Your books update. Your outstanding updates. Your GST liability updates. All instantly.</w:t>
+        <w:t xml:space="preserve">The system ensures no goods leave without a paper trail — and it’s not a setting you can turn off.</w:t>
       </w:r>
     </w:p>
     <w:p>
@@ -926,7 +742,7 @@
         <w:t xml:space="preserve"> </w:t>
       </w:r>
       <w:r>
-        <w:t xml:space="preserve">An invoice in Kinto is not just a document sent to a customer. It is a trigger that automatically updates five different parts of your business simultaneously.</w:t>
+        <w:t xml:space="preserve">Dispatch is enforced, not optional. A gatepass cannot exist without an invoice. An invoice cannot exist without a gatepass. Every truck that leaves is accounted for — automatically and permanently.</w:t>
       </w:r>
     </w:p>
     <w:p>
@@ -944,37 +760,31 @@
         <w:t xml:space="preserve"> </w:t>
       </w:r>
       <w:r>
-        <w:t xml:space="preserve">When an invoice is saved:</w:t>
-      </w:r>
-      <w:r>
-        <w:t xml:space="preserve"> </w:t>
-      </w:r>
-      <w:r>
-        <w:t xml:space="preserve">1. The customer’s outstanding balance increases automatically</w:t>
-      </w:r>
-      <w:r>
-        <w:t xml:space="preserve"> </w:t>
-      </w:r>
-      <w:r>
-        <w:t xml:space="preserve">2. The GST liability account (CGST/SGST or IGST, calculated by buyer state) is posted automatically</w:t>
-      </w:r>
-      <w:r>
-        <w:t xml:space="preserve"> </w:t>
-      </w:r>
-      <w:r>
-        <w:t xml:space="preserve">3. The sales revenue account is credited automatically in the ledger</w:t>
-      </w:r>
-      <w:r>
-        <w:t xml:space="preserve"> </w:t>
-      </w:r>
-      <w:r>
-        <w:t xml:space="preserve">4. The invoice appears in the pending payments dashboard immediately</w:t>
-      </w:r>
-      <w:r>
-        <w:t xml:space="preserve"> </w:t>
-      </w:r>
-      <w:r>
-        <w:t xml:space="preserve">5. If a customer advance was recorded earlier, it is automatically adjusted against this invoice</w:t>
+        <w:t xml:space="preserve">When a gatepass is created and confirmed:</w:t>
+      </w:r>
+      <w:r>
+        <w:t xml:space="preserve"> </w:t>
+      </w:r>
+      <w:r>
+        <w:t xml:space="preserve">1. The linked invoice is marked as dispatched automatically</w:t>
+      </w:r>
+      <w:r>
+        <w:t xml:space="preserve"> </w:t>
+      </w:r>
+      <w:r>
+        <w:t xml:space="preserve">2. Finished goods stock is deducted from inventory immediately</w:t>
+      </w:r>
+      <w:r>
+        <w:t xml:space="preserve"> </w:t>
+      </w:r>
+      <w:r>
+        <w:t xml:space="preserve">3. A delivery challan is generated for printing — no separate document to prepare</w:t>
+      </w:r>
+      <w:r>
+        <w:t xml:space="preserve"> </w:t>
+      </w:r>
+      <w:r>
+        <w:t xml:space="preserve">4. Dispatch tracking record is created (vehicle, driver, transporter, time)</w:t>
       </w:r>
     </w:p>
     <w:p>
@@ -982,6 +792,48 @@
         <w:pStyle w:val="BodyText"/>
       </w:pPr>
       <w:r>
+        <w:t xml:space="preserve">When a sales return is received:</w:t>
+      </w:r>
+      <w:r>
+        <w:t xml:space="preserve"> </w:t>
+      </w:r>
+      <w:r>
+        <w:t xml:space="preserve">1. Goods are re-added to finished goods inventory automatically</w:t>
+      </w:r>
+      <w:r>
+        <w:t xml:space="preserve"> </w:t>
+      </w:r>
+      <w:r>
+        <w:t xml:space="preserve">2. A credit note is triggered in the</w:t>
+      </w:r>
+      <w:r>
+        <w:t xml:space="preserve"> </w:t>
+      </w:r>
+      <w:r>
+        <w:rPr>
+          <w:b/>
+          <w:bCs/>
+        </w:rPr>
+        <w:t xml:space="preserve">Invoicing</w:t>
+      </w:r>
+      <w:r>
+        <w:t xml:space="preserve"> </w:t>
+      </w:r>
+      <w:r>
+        <w:t xml:space="preserve">module</w:t>
+      </w:r>
+      <w:r>
+        <w:t xml:space="preserve"> </w:t>
+      </w:r>
+      <w:r>
+        <w:t xml:space="preserve">3. The accounting reversal posts automatically</w:t>
+      </w:r>
+    </w:p>
+    <w:p>
+      <w:pPr>
+        <w:pStyle w:val="BodyText"/>
+      </w:pPr>
+      <w:r>
         <w:rPr>
           <w:b/>
           <w:bCs/>
@@ -992,133 +844,89 @@
         <w:t xml:space="preserve"> </w:t>
       </w:r>
       <w:r>
-        <w:t xml:space="preserve">- Invoice is created only after a</w:t>
-      </w:r>
-      <w:r>
-        <w:t xml:space="preserve"> </w:t>
-      </w:r>
-      <w:r>
-        <w:rPr>
-          <w:b/>
-          <w:bCs/>
-        </w:rPr>
-        <w:t xml:space="preserve">Gatepass</w:t>
-      </w:r>
-      <w:r>
-        <w:t xml:space="preserve"> </w:t>
-      </w:r>
-      <w:r>
-        <w:t xml:space="preserve">is confirmed — dispatch and billing are always in sync</w:t>
-      </w:r>
-      <w:r>
-        <w:t xml:space="preserve"> </w:t>
-      </w:r>
-      <w:r>
-        <w:t xml:space="preserve">- Revenue posts automatically to</w:t>
-      </w:r>
-      <w:r>
-        <w:t xml:space="preserve"> </w:t>
-      </w:r>
-      <w:r>
-        <w:rPr>
-          <w:b/>
-          <w:bCs/>
-        </w:rPr>
-        <w:t xml:space="preserve">Accounting &amp; Ledger</w:t>
-      </w:r>
-      <w:r>
-        <w:t xml:space="preserve"> </w:t>
-      </w:r>
-      <w:r>
-        <w:t xml:space="preserve">— P&amp;L is always current</w:t>
-      </w:r>
-      <w:r>
-        <w:t xml:space="preserve"> </w:t>
-      </w:r>
-      <w:r>
-        <w:t xml:space="preserve">- Outstanding balances feed the</w:t>
-      </w:r>
-      <w:r>
-        <w:t xml:space="preserve"> </w:t>
-      </w:r>
-      <w:r>
-        <w:rPr>
-          <w:b/>
-          <w:bCs/>
-        </w:rPr>
-        <w:t xml:space="preserve">MIS Cash Analytics</w:t>
-      </w:r>
-      <w:r>
-        <w:t xml:space="preserve"> </w:t>
-      </w:r>
-      <w:r>
-        <w:t xml:space="preserve">dashboard — collections visibility is live</w:t>
-      </w:r>
-      <w:r>
-        <w:t xml:space="preserve"> </w:t>
-      </w:r>
-      <w:r>
-        <w:t xml:space="preserve">- Customer advances recorded in</w:t>
-      </w:r>
-      <w:r>
-        <w:t xml:space="preserve"> </w:t>
-      </w:r>
-      <w:r>
-        <w:rPr>
-          <w:b/>
-          <w:bCs/>
-        </w:rPr>
-        <w:t xml:space="preserve">Accounting</w:t>
-      </w:r>
-      <w:r>
-        <w:t xml:space="preserve"> </w:t>
-      </w:r>
-      <w:r>
-        <w:t xml:space="preserve">are auto-adjusted when an invoice is raised</w:t>
-      </w:r>
-      <w:r>
-        <w:t xml:space="preserve"> </w:t>
-      </w:r>
-      <w:r>
-        <w:t xml:space="preserve">- Payment collection records in</w:t>
-      </w:r>
-      <w:r>
-        <w:t xml:space="preserve"> </w:t>
-      </w:r>
-      <w:r>
-        <w:rPr>
-          <w:b/>
-          <w:bCs/>
-        </w:rPr>
-        <w:t xml:space="preserve">Accounting</w:t>
-      </w:r>
-      <w:r>
-        <w:t xml:space="preserve"> </w:t>
-      </w:r>
-      <w:r>
-        <w:t xml:space="preserve">reduce the invoice outstanding automatically</w:t>
-      </w:r>
-      <w:r>
-        <w:t xml:space="preserve"> </w:t>
-      </w:r>
-      <w:r>
-        <w:t xml:space="preserve">- Credit notes from</w:t>
-      </w:r>
-      <w:r>
-        <w:t xml:space="preserve"> </w:t>
-      </w:r>
-      <w:r>
-        <w:rPr>
-          <w:b/>
-          <w:bCs/>
-        </w:rPr>
-        <w:t xml:space="preserve">Dispatch</w:t>
-      </w:r>
-      <w:r>
-        <w:t xml:space="preserve"> </w:t>
-      </w:r>
-      <w:r>
-        <w:t xml:space="preserve">sales returns reverse the invoice accounting automatically</w:t>
+        <w:t xml:space="preserve">- Gatepass pulls stock from</w:t>
+      </w:r>
+      <w:r>
+        <w:t xml:space="preserve"> </w:t>
+      </w:r>
+      <w:r>
+        <w:rPr>
+          <w:b/>
+          <w:bCs/>
+        </w:rPr>
+        <w:t xml:space="preserve">Production &amp; Inventory</w:t>
+      </w:r>
+      <w:r>
+        <w:t xml:space="preserve"> </w:t>
+      </w:r>
+      <w:r>
+        <w:t xml:space="preserve">— you can only dispatch goods that physically exist in stock</w:t>
+      </w:r>
+      <w:r>
+        <w:t xml:space="preserve"> </w:t>
+      </w:r>
+      <w:r>
+        <w:t xml:space="preserve">- Gatepass is mandatory before an</w:t>
+      </w:r>
+      <w:r>
+        <w:t xml:space="preserve"> </w:t>
+      </w:r>
+      <w:r>
+        <w:rPr>
+          <w:b/>
+          <w:bCs/>
+        </w:rPr>
+        <w:t xml:space="preserve">Invoice</w:t>
+      </w:r>
+      <w:r>
+        <w:t xml:space="preserve"> </w:t>
+      </w:r>
+      <w:r>
+        <w:t xml:space="preserve">is raised — the workflow enforces this, no workaround exists</w:t>
+      </w:r>
+      <w:r>
+        <w:t xml:space="preserve"> </w:t>
+      </w:r>
+      <w:r>
+        <w:t xml:space="preserve">- Dispatch tracking data feeds</w:t>
+      </w:r>
+      <w:r>
+        <w:t xml:space="preserve"> </w:t>
+      </w:r>
+      <w:r>
+        <w:rPr>
+          <w:b/>
+          <w:bCs/>
+        </w:rPr>
+        <w:t xml:space="preserve">MIS Analytics</w:t>
+      </w:r>
+      <w:r>
+        <w:t xml:space="preserve"> </w:t>
+      </w:r>
+      <w:r>
+        <w:t xml:space="preserve">— delivery performance metrics are always live</w:t>
+      </w:r>
+      <w:r>
+        <w:t xml:space="preserve"> </w:t>
+      </w:r>
+      <w:r>
+        <w:t xml:space="preserve">- Sales returns link back to the original</w:t>
+      </w:r>
+      <w:r>
+        <w:t xml:space="preserve"> </w:t>
+      </w:r>
+      <w:r>
+        <w:rPr>
+          <w:b/>
+          <w:bCs/>
+        </w:rPr>
+        <w:t xml:space="preserve">Invoice</w:t>
+      </w:r>
+      <w:r>
+        <w:t xml:space="preserve"> </w:t>
+      </w:r>
+      <w:r>
+        <w:t xml:space="preserve">and reverse both stock and accounting automatically</w:t>
       </w:r>
     </w:p>
     <w:p>
@@ -1136,25 +944,25 @@
         <w:t xml:space="preserve"> </w:t>
       </w:r>
       <w:r>
-        <w:t xml:space="preserve">- Manual accounting entry after raising an invoice (Tally users know this well)</w:t>
-      </w:r>
-      <w:r>
-        <w:t xml:space="preserve"> </w:t>
-      </w:r>
-      <w:r>
-        <w:t xml:space="preserve">- Manually selecting IGST vs CGST/SGST based on buyer state</w:t>
-      </w:r>
-      <w:r>
-        <w:t xml:space="preserve"> </w:t>
-      </w:r>
-      <w:r>
-        <w:t xml:space="preserve">- Manually tracking customer advances and adjusting them against invoices</w:t>
-      </w:r>
-      <w:r>
-        <w:t xml:space="preserve"> </w:t>
-      </w:r>
-      <w:r>
-        <w:t xml:space="preserve">- Running a separate aging report from a different module</w:t>
+        <w:t xml:space="preserve">- No other mainstream ERP enforces gatepass before invoice as a system-level constraint — it’s always a configurable workflow, meaning it can be bypassed</w:t>
+      </w:r>
+      <w:r>
+        <w:t xml:space="preserve"> </w:t>
+      </w:r>
+      <w:r>
+        <w:t xml:space="preserve">- Separate stock deduction after dispatch</w:t>
+      </w:r>
+      <w:r>
+        <w:t xml:space="preserve"> </w:t>
+      </w:r>
+      <w:r>
+        <w:t xml:space="preserve">- Separate accounting entry for cost of goods dispatched</w:t>
+      </w:r>
+      <w:r>
+        <w:t xml:space="preserve"> </w:t>
+      </w:r>
+      <w:r>
+        <w:t xml:space="preserve">- Manual delivery challan preparation</w:t>
       </w:r>
     </w:p>
     <w:p>
@@ -1164,8 +972,289 @@
         </w:pict>
       </w:r>
     </w:p>
-    <w:bookmarkEnd w:id="24"/>
-    <w:bookmarkStart w:id="25" w:name="accounting-ledger"/>
+    <w:bookmarkEnd w:id="28"/>
+    <w:bookmarkStart w:id="29" w:name="sales-invoicing-gst"/>
+    <w:p>
+      <w:pPr>
+        <w:pStyle w:val="Heading2"/>
+      </w:pPr>
+      <w:r>
+        <w:t xml:space="preserve">Sales Invoicing &amp; GST</w:t>
+      </w:r>
+    </w:p>
+    <w:p>
+      <w:pPr>
+        <w:pStyle w:val="FirstParagraph"/>
+      </w:pPr>
+      <w:r>
+        <w:rPr>
+          <w:b/>
+          <w:bCs/>
+        </w:rPr>
+        <w:t xml:space="preserve">Headline:</w:t>
+      </w:r>
+      <w:r>
+        <w:t xml:space="preserve"> </w:t>
+      </w:r>
+      <w:r>
+        <w:t xml:space="preserve">Raise an invoice. Your books update. Your outstanding updates. Your GST liability updates. All instantly.</w:t>
+      </w:r>
+    </w:p>
+    <w:p>
+      <w:pPr>
+        <w:pStyle w:val="BodyText"/>
+      </w:pPr>
+      <w:r>
+        <w:rPr>
+          <w:b/>
+          <w:bCs/>
+        </w:rPr>
+        <w:t xml:space="preserve">Sub-headline:</w:t>
+      </w:r>
+      <w:r>
+        <w:t xml:space="preserve"> </w:t>
+      </w:r>
+      <w:r>
+        <w:t xml:space="preserve">An invoice in Kinto is not just a document sent to a customer. It is a trigger that automatically updates five different parts of your business simultaneously.</w:t>
+      </w:r>
+    </w:p>
+    <w:p>
+      <w:pPr>
+        <w:pStyle w:val="BodyText"/>
+      </w:pPr>
+      <w:r>
+        <w:rPr>
+          <w:b/>
+          <w:bCs/>
+        </w:rPr>
+        <w:t xml:space="preserve">How the automation works:</w:t>
+      </w:r>
+      <w:r>
+        <w:t xml:space="preserve"> </w:t>
+      </w:r>
+      <w:r>
+        <w:t xml:space="preserve">When an invoice is saved:</w:t>
+      </w:r>
+      <w:r>
+        <w:t xml:space="preserve"> </w:t>
+      </w:r>
+      <w:r>
+        <w:t xml:space="preserve">1. The customer’s outstanding balance increases automatically</w:t>
+      </w:r>
+      <w:r>
+        <w:t xml:space="preserve"> </w:t>
+      </w:r>
+      <w:r>
+        <w:t xml:space="preserve">2. The GST liability account (CGST/SGST or IGST, calculated by buyer state) is posted automatically</w:t>
+      </w:r>
+      <w:r>
+        <w:t xml:space="preserve"> </w:t>
+      </w:r>
+      <w:r>
+        <w:t xml:space="preserve">3. The sales revenue account is credited automatically in the ledger</w:t>
+      </w:r>
+      <w:r>
+        <w:t xml:space="preserve"> </w:t>
+      </w:r>
+      <w:r>
+        <w:t xml:space="preserve">4. The invoice appears in the pending payments dashboard immediately</w:t>
+      </w:r>
+      <w:r>
+        <w:t xml:space="preserve"> </w:t>
+      </w:r>
+      <w:r>
+        <w:t xml:space="preserve">5. If a customer advance was recorded earlier, it is automatically adjusted against this invoice</w:t>
+      </w:r>
+    </w:p>
+    <w:p>
+      <w:pPr>
+        <w:pStyle w:val="BodyText"/>
+      </w:pPr>
+      <w:r>
+        <w:rPr>
+          <w:b/>
+          <w:bCs/>
+        </w:rPr>
+        <w:t xml:space="preserve">How it connects to other modules:</w:t>
+      </w:r>
+      <w:r>
+        <w:t xml:space="preserve"> </w:t>
+      </w:r>
+      <w:r>
+        <w:t xml:space="preserve">- Invoice is created only after a</w:t>
+      </w:r>
+      <w:r>
+        <w:t xml:space="preserve"> </w:t>
+      </w:r>
+      <w:r>
+        <w:rPr>
+          <w:b/>
+          <w:bCs/>
+        </w:rPr>
+        <w:t xml:space="preserve">Gatepass</w:t>
+      </w:r>
+      <w:r>
+        <w:t xml:space="preserve"> </w:t>
+      </w:r>
+      <w:r>
+        <w:t xml:space="preserve">is confirmed — dispatch and billing are always in sync</w:t>
+      </w:r>
+      <w:r>
+        <w:t xml:space="preserve"> </w:t>
+      </w:r>
+      <w:r>
+        <w:t xml:space="preserve">- Revenue posts automatically to</w:t>
+      </w:r>
+      <w:r>
+        <w:t xml:space="preserve"> </w:t>
+      </w:r>
+      <w:r>
+        <w:rPr>
+          <w:b/>
+          <w:bCs/>
+        </w:rPr>
+        <w:t xml:space="preserve">Accounting &amp; Ledger</w:t>
+      </w:r>
+      <w:r>
+        <w:t xml:space="preserve"> </w:t>
+      </w:r>
+      <w:r>
+        <w:t xml:space="preserve">— P&amp;L is always current</w:t>
+      </w:r>
+      <w:r>
+        <w:t xml:space="preserve"> </w:t>
+      </w:r>
+      <w:r>
+        <w:t xml:space="preserve">- Outstanding balances feed the</w:t>
+      </w:r>
+      <w:r>
+        <w:t xml:space="preserve"> </w:t>
+      </w:r>
+      <w:r>
+        <w:rPr>
+          <w:b/>
+          <w:bCs/>
+        </w:rPr>
+        <w:t xml:space="preserve">MIS Cash Analytics</w:t>
+      </w:r>
+      <w:r>
+        <w:t xml:space="preserve"> </w:t>
+      </w:r>
+      <w:r>
+        <w:t xml:space="preserve">dashboard — collections visibility is live</w:t>
+      </w:r>
+      <w:r>
+        <w:t xml:space="preserve"> </w:t>
+      </w:r>
+      <w:r>
+        <w:t xml:space="preserve">- Customer advances recorded in</w:t>
+      </w:r>
+      <w:r>
+        <w:t xml:space="preserve"> </w:t>
+      </w:r>
+      <w:r>
+        <w:rPr>
+          <w:b/>
+          <w:bCs/>
+        </w:rPr>
+        <w:t xml:space="preserve">Accounting</w:t>
+      </w:r>
+      <w:r>
+        <w:t xml:space="preserve"> </w:t>
+      </w:r>
+      <w:r>
+        <w:t xml:space="preserve">are auto-adjusted when an invoice is raised</w:t>
+      </w:r>
+      <w:r>
+        <w:t xml:space="preserve"> </w:t>
+      </w:r>
+      <w:r>
+        <w:t xml:space="preserve">- Payment collection records in</w:t>
+      </w:r>
+      <w:r>
+        <w:t xml:space="preserve"> </w:t>
+      </w:r>
+      <w:r>
+        <w:rPr>
+          <w:b/>
+          <w:bCs/>
+        </w:rPr>
+        <w:t xml:space="preserve">Accounting</w:t>
+      </w:r>
+      <w:r>
+        <w:t xml:space="preserve"> </w:t>
+      </w:r>
+      <w:r>
+        <w:t xml:space="preserve">reduce the invoice outstanding automatically</w:t>
+      </w:r>
+      <w:r>
+        <w:t xml:space="preserve"> </w:t>
+      </w:r>
+      <w:r>
+        <w:t xml:space="preserve">- Credit notes from</w:t>
+      </w:r>
+      <w:r>
+        <w:t xml:space="preserve"> </w:t>
+      </w:r>
+      <w:r>
+        <w:rPr>
+          <w:b/>
+          <w:bCs/>
+        </w:rPr>
+        <w:t xml:space="preserve">Dispatch</w:t>
+      </w:r>
+      <w:r>
+        <w:t xml:space="preserve"> </w:t>
+      </w:r>
+      <w:r>
+        <w:t xml:space="preserve">sales returns reverse the invoice accounting automatically</w:t>
+      </w:r>
+    </w:p>
+    <w:p>
+      <w:pPr>
+        <w:pStyle w:val="BodyText"/>
+      </w:pPr>
+      <w:r>
+        <w:rPr>
+          <w:b/>
+          <w:bCs/>
+        </w:rPr>
+        <w:t xml:space="preserve">What other apps make you do manually:</w:t>
+      </w:r>
+      <w:r>
+        <w:t xml:space="preserve"> </w:t>
+      </w:r>
+      <w:r>
+        <w:t xml:space="preserve">- Manual accounting entry after raising an invoice (Tally users know this well)</w:t>
+      </w:r>
+      <w:r>
+        <w:t xml:space="preserve"> </w:t>
+      </w:r>
+      <w:r>
+        <w:t xml:space="preserve">- Manually selecting IGST vs CGST/SGST based on buyer state</w:t>
+      </w:r>
+      <w:r>
+        <w:t xml:space="preserve"> </w:t>
+      </w:r>
+      <w:r>
+        <w:t xml:space="preserve">- Manually tracking customer advances and adjusting them against invoices</w:t>
+      </w:r>
+      <w:r>
+        <w:t xml:space="preserve"> </w:t>
+      </w:r>
+      <w:r>
+        <w:t xml:space="preserve">- Running a separate aging report from a different module</w:t>
+      </w:r>
+    </w:p>
+    <w:p>
+      <w:r>
+        <w:pict>
+          <v:rect style="width:0;height:1.5pt" o:hralign="center" o:hrstd="t" o:hr="t"/>
+        </w:pict>
+      </w:r>
+    </w:p>
+    <w:bookmarkEnd w:id="29"/>
+    <w:bookmarkStart w:id="30" w:name="accounting-ledger"/>
     <w:p>
       <w:pPr>
         <w:pStyle w:val="Heading2"/>
@@ -1589,8 +1678,8 @@
         </w:pict>
       </w:r>
     </w:p>
-    <w:bookmarkEnd w:id="25"/>
-    <w:bookmarkStart w:id="26" w:name="preventive-maintenance"/>
+    <w:bookmarkEnd w:id="30"/>
+    <w:bookmarkStart w:id="31" w:name="preventive-maintenance"/>
     <w:p>
       <w:pPr>
         <w:pStyle w:val="Heading2"/>
@@ -1842,8 +1931,8 @@
         </w:pict>
       </w:r>
     </w:p>
-    <w:bookmarkEnd w:id="26"/>
-    <w:bookmarkStart w:id="27" w:name="whatsapp-checklists-machine-startup"/>
+    <w:bookmarkEnd w:id="31"/>
+    <w:bookmarkStart w:id="32" w:name="whatsapp-checklists-machine-startup"/>
     <w:p>
       <w:pPr>
         <w:pStyle w:val="Heading2"/>
@@ -2083,8 +2172,8 @@
         </w:pict>
       </w:r>
     </w:p>
-    <w:bookmarkEnd w:id="27"/>
-    <w:bookmarkStart w:id="28" w:name="hr-payroll"/>
+    <w:bookmarkEnd w:id="32"/>
+    <w:bookmarkStart w:id="33" w:name="hr-payroll"/>
     <w:p>
       <w:pPr>
         <w:pStyle w:val="Heading2"/>
@@ -2468,8 +2557,8 @@
         </w:pict>
       </w:r>
     </w:p>
-    <w:bookmarkEnd w:id="28"/>
-    <w:bookmarkStart w:id="29" w:name="employee-self-service-ess-portal"/>
+    <w:bookmarkEnd w:id="33"/>
+    <w:bookmarkStart w:id="34" w:name="employee-self-service-ess-portal"/>
     <w:p>
       <w:pPr>
         <w:pStyle w:val="Heading2"/>
@@ -2657,8 +2746,8 @@
         </w:pict>
       </w:r>
     </w:p>
-    <w:bookmarkEnd w:id="29"/>
-    <w:bookmarkStart w:id="30" w:name="crm-lead-management"/>
+    <w:bookmarkEnd w:id="34"/>
+    <w:bookmarkStart w:id="35" w:name="crm-lead-management"/>
     <w:p>
       <w:pPr>
         <w:pStyle w:val="Heading2"/>
@@ -2874,8 +2963,8 @@
         </w:pict>
       </w:r>
     </w:p>
-    <w:bookmarkEnd w:id="30"/>
-    <w:bookmarkStart w:id="31" w:name="mis-analytics"/>
+    <w:bookmarkEnd w:id="35"/>
+    <w:bookmarkStart w:id="36" w:name="mis-analytics"/>
     <w:p>
       <w:pPr>
         <w:pStyle w:val="Heading2"/>
@@ -3267,8 +3356,8 @@
         </w:pict>
       </w:r>
     </w:p>
-    <w:bookmarkEnd w:id="31"/>
-    <w:bookmarkStart w:id="32" w:name="expenses-management"/>
+    <w:bookmarkEnd w:id="36"/>
+    <w:bookmarkStart w:id="37" w:name="expenses-management"/>
     <w:p>
       <w:pPr>
         <w:pStyle w:val="Heading2"/>
@@ -3446,8 +3535,8 @@
         </w:pict>
       </w:r>
     </w:p>
-    <w:bookmarkEnd w:id="32"/>
-    <w:bookmarkStart w:id="33" w:name="documents"/>
+    <w:bookmarkEnd w:id="37"/>
+    <w:bookmarkStart w:id="38" w:name="documents"/>
     <w:p>
       <w:pPr>
         <w:pStyle w:val="Heading2"/>
@@ -3649,8 +3738,8 @@
         </w:pict>
       </w:r>
     </w:p>
-    <w:bookmarkEnd w:id="33"/>
-    <w:bookmarkStart w:id="34" w:name="the-interconnection-map"/>
+    <w:bookmarkEnd w:id="38"/>
+    <w:bookmarkStart w:id="39" w:name="the-interconnection-map"/>
     <w:p>
       <w:pPr>
         <w:pStyle w:val="Heading2"/>
@@ -3897,8 +3986,8 @@
         <w:t xml:space="preserve">Every arrow is automatic. No manual data transfer. No exports. No re-entry.</w:t>
       </w:r>
     </w:p>
-    <w:bookmarkEnd w:id="34"/>
-    <w:bookmarkEnd w:id="35"/>
+    <w:bookmarkEnd w:id="39"/>
+    <w:bookmarkEnd w:id="40"/>
     <w:sectPr/>
   </w:body>
 </w:document>

</xml_diff>